<commit_message>
feat: Add Payment Method Step to application process
- Implemented PaymentMethodStep component for selecting payment methods.
- Integrated payment reference input for digital payments (GCash, Maya).
- Added manual payment instructions for Barangay Hall and City Hall options.
- Updated PersonalDetailsStep to include smart placeholders based on job category.
- Enhanced ReviewStep with improved layout and document status indicators.
- Updated styles for better UI consistency across application steps.
- Modified tsconfig.json to change exactOptionalPropertyTypes setting.
</commit_message>
<xml_diff>
--- a/docs/eMediCardProject1.2Main.docx
+++ b/docs/eMediCardProject1.2Main.docx
@@ -84,7 +84,7 @@
           <w:szCs w:val="22"/>
           <w:lang w:val="en-US"/>
         </w:rPr>
-        <w:t xml:space="preserve">Base Health Card </w:t>
+        <w:t>Base</w:t>
       </w:r>
       <w:r>
         <w:rPr>
@@ -94,7 +94,7 @@
           <w:szCs w:val="22"/>
           <w:lang w:val="en-US"/>
         </w:rPr>
-        <w:t>Management</w:t>
+        <w:t>d</w:t>
       </w:r>
       <w:r>
         <w:rPr>
@@ -104,6 +104,26 @@
           <w:szCs w:val="22"/>
           <w:lang w:val="en-US"/>
         </w:rPr>
+        <w:t xml:space="preserve"> Health Card </w:t>
+      </w:r>
+      <w:r>
+        <w:rPr>
+          <w:rFonts w:eastAsia="Times New Roman" w:cs="Times New Roman"/>
+          <w:noProof w:val="0"/>
+          <w:kern w:val="0"/>
+          <w:szCs w:val="22"/>
+          <w:lang w:val="en-US"/>
+        </w:rPr>
+        <w:t>Management</w:t>
+      </w:r>
+      <w:r>
+        <w:rPr>
+          <w:rFonts w:eastAsia="Times New Roman" w:cs="Times New Roman"/>
+          <w:noProof w:val="0"/>
+          <w:kern w:val="0"/>
+          <w:szCs w:val="22"/>
+          <w:lang w:val="en-US"/>
+        </w:rPr>
         <w:t xml:space="preserve"> System</w:t>
       </w:r>
       <w:bookmarkEnd w:id="0"/>
@@ -353,7 +373,25 @@
           <w:szCs w:val="24"/>
         </w:rPr>
         <w:tab/>
-        <w:t>Application System</w:t>
+      </w:r>
+      <w:r>
+        <w:rPr>
+          <w:rFonts w:eastAsia="Times New Roman" w:cs="Times New Roman"/>
+          <w:lang w:val="en-US"/>
+        </w:rPr>
+        <w:t>Management</w:t>
+      </w:r>
+      <w:r>
+        <w:rPr>
+          <w:szCs w:val="24"/>
+        </w:rPr>
+        <w:t xml:space="preserve"> System</w:t>
+      </w:r>
+      <w:r>
+        <w:rPr>
+          <w:szCs w:val="24"/>
+        </w:rPr>
+        <w:t xml:space="preserve"> </w:t>
       </w:r>
     </w:p>
     <w:p>
@@ -2520,21 +2558,7 @@
                 <w:b w:val="0"/>
                 <w:bCs/>
               </w:rPr>
-              <w:t xml:space="preserve">         </w:t>
-            </w:r>
-            <w:r>
-              <w:rPr>
-                <w:b w:val="0"/>
-                <w:bCs/>
-              </w:rPr>
-              <w:t xml:space="preserve">Appendix </w:t>
-            </w:r>
-            <w:r>
-              <w:rPr>
-                <w:b w:val="0"/>
-                <w:bCs/>
-              </w:rPr>
-              <w:t>B</w:t>
+              <w:t xml:space="preserve">         Appendix B</w:t>
             </w:r>
           </w:p>
           <w:p>
@@ -3488,7 +3512,25 @@
           <w:b w:val="0"/>
           <w:szCs w:val="24"/>
         </w:rPr>
-        <w:t xml:space="preserve"> notifies Yellow card applicants of their scheduled in-person food safety orientation. The app displays their assigned date and generates a QR code for attendance scanning at the venue.</w:t>
+        <w:t xml:space="preserve"> notifies </w:t>
+      </w:r>
+      <w:proofErr w:type="gramStart"/>
+      <w:r>
+        <w:rPr>
+          <w:rFonts w:eastAsia="Times New Roman" w:cs="Times New Roman"/>
+          <w:b w:val="0"/>
+          <w:szCs w:val="24"/>
+        </w:rPr>
+        <w:t>Yellow</w:t>
+      </w:r>
+      <w:proofErr w:type="gramEnd"/>
+      <w:r>
+        <w:rPr>
+          <w:rFonts w:eastAsia="Times New Roman" w:cs="Times New Roman"/>
+          <w:b w:val="0"/>
+          <w:szCs w:val="24"/>
+        </w:rPr>
+        <w:t xml:space="preserve"> card applicants of their scheduled in-person food safety orientation. The app displays their assigned date and generates a QR code for attendance scanning at the venue.</w:t>
       </w:r>
     </w:p>
     <w:p>
@@ -3713,7 +3755,16 @@
           <w:b w:val="0"/>
           <w:szCs w:val="24"/>
         </w:rPr>
-        <w:t>The eMediCard mobile application is designed to enhance and digitize the health card registration and renewal process for employees in Davao City.</w:t>
+        <w:t xml:space="preserve">The eMediCard mobile application is designed to enhance and digitize the health card registration and renewal process for employees in Davao </w:t>
+      </w:r>
+      <w:proofErr w:type="gramStart"/>
+      <w:r>
+        <w:rPr>
+          <w:rFonts w:eastAsia="Times New Roman" w:cs="Times New Roman"/>
+          <w:b w:val="0"/>
+          <w:szCs w:val="24"/>
+        </w:rPr>
+        <w:t>City.</w:t>
       </w:r>
       <w:r>
         <w:rPr>
@@ -3723,6 +3774,7 @@
         </w:rPr>
         <w:t>.</w:t>
       </w:r>
+      <w:proofErr w:type="gramEnd"/>
       <w:r>
         <w:rPr>
           <w:rFonts w:eastAsia="Times New Roman" w:cs="Times New Roman"/>
@@ -4775,14 +4827,7 @@
           <w:rFonts w:cs="Times New Roman"/>
           <w:b w:val="0"/>
         </w:rPr>
-        <w:t>This project is primarily a mobile-based application, meaning that its core functionality is designed for mobile platforms. However, a web-based version has been introduced exclusively for admin use</w:t>
-      </w:r>
-      <w:r>
-        <w:rPr>
-          <w:rFonts w:cs="Times New Roman"/>
-          <w:b w:val="0"/>
-        </w:rPr>
-        <w:t>.</w:t>
+        <w:t>This project is primarily a mobile-based application, meaning that its core functionality is designed for mobile platforms. However, a web-based version has been introduced exclusively for admin use.</w:t>
       </w:r>
       <w:r>
         <w:rPr>
@@ -6901,7 +6946,27 @@
           <w:lang w:val="en-US"/>
         </w:rPr>
         <w:lastRenderedPageBreak/>
-        <w:t>submission interface capable of handling various file types  while enabling administrators to flag missing or questionable entries. This reinforced the need for real-time status notifications and dynamic checklists within the app.</w:t>
+        <w:t xml:space="preserve">submission interface capable of handling various file </w:t>
+      </w:r>
+      <w:proofErr w:type="gramStart"/>
+      <w:r>
+        <w:rPr>
+          <w:rFonts w:eastAsia="Times New Roman" w:cs="Times New Roman"/>
+          <w:b w:val="0"/>
+          <w:szCs w:val="24"/>
+          <w:lang w:val="en-US"/>
+        </w:rPr>
+        <w:t>types  while</w:t>
+      </w:r>
+      <w:proofErr w:type="gramEnd"/>
+      <w:r>
+        <w:rPr>
+          <w:rFonts w:eastAsia="Times New Roman" w:cs="Times New Roman"/>
+          <w:b w:val="0"/>
+          <w:szCs w:val="24"/>
+          <w:lang w:val="en-US"/>
+        </w:rPr>
+        <w:t xml:space="preserve"> enabling administrators to flag missing or questionable entries. This reinforced the need for real-time status notifications and dynamic checklists within the app.</w:t>
       </w:r>
     </w:p>
     <w:p>
@@ -6959,7 +7024,27 @@
           <w:szCs w:val="24"/>
           <w:lang w:val="en-US"/>
         </w:rPr>
-        <w:t>who were frequent health card applicants. These users described the longest queue times as one of their main concerns during the renewal process, but noted that they clearly understood the difference between Yellow, Green, and Pink health card types. They explained that this information is included in the official paper provided during initial registration or renewal at the venue. However, they expressed frustration over the long waiting times during renewal, sharing that queues often extended outside the mall premises. Based on this, the team retained the classification system in the app but shifted focus toward enhancing user guidance, improving progress transparency, and introducing digital queuing features to reduce physical congestion.</w:t>
+        <w:t xml:space="preserve">who were frequent health card applicants. These users described the longest queue times as one of their main concerns during the renewal process, but noted that they clearly understood the difference between </w:t>
+      </w:r>
+      <w:proofErr w:type="gramStart"/>
+      <w:r>
+        <w:rPr>
+          <w:rFonts w:eastAsia="Times New Roman" w:cs="Times New Roman"/>
+          <w:b w:val="0"/>
+          <w:szCs w:val="24"/>
+          <w:lang w:val="en-US"/>
+        </w:rPr>
+        <w:t>Yellow, Green, and Pink</w:t>
+      </w:r>
+      <w:proofErr w:type="gramEnd"/>
+      <w:r>
+        <w:rPr>
+          <w:rFonts w:eastAsia="Times New Roman" w:cs="Times New Roman"/>
+          <w:b w:val="0"/>
+          <w:szCs w:val="24"/>
+          <w:lang w:val="en-US"/>
+        </w:rPr>
+        <w:t xml:space="preserve"> health card types. They explained that this information is included in the official paper provided during initial registration or renewal at the venue. However, they expressed frustration over the long waiting times during renewal, sharing that queues often extended outside the mall premises. Based on this, the team retained the classification system in the app but shifted focus toward enhancing user guidance, improving progress transparency, and introducing digital queuing features to reduce physical congestion.</w:t>
       </w:r>
     </w:p>
     <w:p>
@@ -7003,7 +7088,27 @@
           <w:szCs w:val="24"/>
           <w:lang w:val="en-US"/>
         </w:rPr>
-        <w:t>At the end of the requirements analysis phase, the team compiled a comprehensive list of system needs, which included: user registration and profile management, classification-based document submission, digital orientation scheduling for Yellow card holders, payment integration, digital health card issuance, admin dashboard features, and real-time notification systems. These components were validated through both user-side interviews and administrative consultations, ensuring the solution was practical, secure, and aligned with the CHO’s workflow and compliance standards.</w:t>
+        <w:t xml:space="preserve">At the end of the requirements analysis phase, the team compiled a comprehensive list of system needs, which included: user registration and profile management, classification-based document submission, digital orientation scheduling for </w:t>
+      </w:r>
+      <w:proofErr w:type="gramStart"/>
+      <w:r>
+        <w:rPr>
+          <w:rFonts w:eastAsia="Times New Roman" w:cs="Times New Roman"/>
+          <w:b w:val="0"/>
+          <w:szCs w:val="24"/>
+          <w:lang w:val="en-US"/>
+        </w:rPr>
+        <w:t>Yellow</w:t>
+      </w:r>
+      <w:proofErr w:type="gramEnd"/>
+      <w:r>
+        <w:rPr>
+          <w:rFonts w:eastAsia="Times New Roman" w:cs="Times New Roman"/>
+          <w:b w:val="0"/>
+          <w:szCs w:val="24"/>
+          <w:lang w:val="en-US"/>
+        </w:rPr>
+        <w:t xml:space="preserve"> card holders, payment integration, digital health card issuance, admin dashboard features, and real-time notification systems. These components were validated through both user-side interviews and administrative consultations, ensuring the solution was practical, secure, and aligned with the CHO’s workflow and compliance standards.</w:t>
       </w:r>
     </w:p>
     <w:p>
@@ -9488,6 +9593,7 @@
         </w:rPr>
         <w:t xml:space="preserve"> </w:t>
       </w:r>
+      <w:proofErr w:type="gramStart"/>
       <w:r>
         <w:rPr>
           <w:b w:val="0"/>
@@ -9504,6 +9610,7 @@
         </w:rPr>
         <w:t>.</w:t>
       </w:r>
+      <w:proofErr w:type="gramEnd"/>
     </w:p>
     <w:p>
       <w:pPr>
@@ -9609,7 +9716,27 @@
           <w:bCs/>
           <w:szCs w:val="24"/>
         </w:rPr>
-        <w:t>To make seminar attendance more efficient, the system includes QR code-based tracking for Yellow card holders</w:t>
+        <w:t xml:space="preserve">To make seminar attendance more efficient, the system includes QR code-based tracking for </w:t>
+      </w:r>
+      <w:proofErr w:type="gramStart"/>
+      <w:r>
+        <w:rPr>
+          <w:rFonts w:eastAsia="Times New Roman" w:cs="Times New Roman"/>
+          <w:b w:val="0"/>
+          <w:bCs/>
+          <w:szCs w:val="24"/>
+        </w:rPr>
+        <w:t>Yellow</w:t>
+      </w:r>
+      <w:proofErr w:type="gramEnd"/>
+      <w:r>
+        <w:rPr>
+          <w:rFonts w:eastAsia="Times New Roman" w:cs="Times New Roman"/>
+          <w:b w:val="0"/>
+          <w:bCs/>
+          <w:szCs w:val="24"/>
+        </w:rPr>
+        <w:t xml:space="preserve"> card holders</w:t>
       </w:r>
       <w:r>
         <w:rPr>
@@ -9924,14 +10051,32 @@
           <w:iCs/>
           <w:lang w:eastAsia="en-PH"/>
         </w:rPr>
-        <w:t>Mobile health apps interactive tool</w:t>
-      </w:r>
-      <w:r>
-        <w:rPr>
-          <w:b w:val="0"/>
+        <w:t xml:space="preserve">Mobile health apps interactive </w:t>
+      </w:r>
+      <w:proofErr w:type="gramStart"/>
+      <w:r>
+        <w:rPr>
+          <w:b w:val="0"/>
+          <w:i/>
+          <w:iCs/>
           <w:lang w:eastAsia="en-PH"/>
         </w:rPr>
-        <w:t xml:space="preserve">.from </w:t>
+        <w:t>tool</w:t>
+      </w:r>
+      <w:r>
+        <w:rPr>
+          <w:b w:val="0"/>
+          <w:lang w:eastAsia="en-PH"/>
+        </w:rPr>
+        <w:t>.from</w:t>
+      </w:r>
+      <w:proofErr w:type="gramEnd"/>
+      <w:r>
+        <w:rPr>
+          <w:b w:val="0"/>
+          <w:lang w:eastAsia="en-PH"/>
+        </w:rPr>
+        <w:t xml:space="preserve"> </w:t>
       </w:r>
       <w:hyperlink r:id="rId15" w:history="1">
         <w:r>
@@ -16806,19 +16951,7 @@
               <w:rPr>
                 <w:lang w:val="en-US"/>
               </w:rPr>
-              <w:t>Bislig City National High</w:t>
-            </w:r>
-            <w:r>
-              <w:rPr>
-                <w:lang w:val="en-US"/>
-              </w:rPr>
-              <w:t xml:space="preserve"> S</w:t>
-            </w:r>
-            <w:r>
-              <w:rPr>
-                <w:lang w:val="en-US"/>
-              </w:rPr>
-              <w:t>chool</w:t>
+              <w:t>Bislig City National High School</w:t>
             </w:r>
           </w:p>
         </w:tc>
@@ -16984,19 +17117,7 @@
               <w:rPr>
                 <w:lang w:val="en-US"/>
               </w:rPr>
-              <w:t xml:space="preserve">Paligawan Matanda Elementary </w:t>
-            </w:r>
-            <w:r>
-              <w:rPr>
-                <w:lang w:val="en-US"/>
-              </w:rPr>
-              <w:t>Sc</w:t>
-            </w:r>
-            <w:r>
-              <w:rPr>
-                <w:lang w:val="en-US"/>
-              </w:rPr>
-              <w:t>hool</w:t>
+              <w:t>Paligawan Matanda Elementary School</w:t>
             </w:r>
           </w:p>
         </w:tc>
@@ -26407,6 +26528,7 @@
   <w:style w:type="character" w:default="1" w:styleId="DefaultParagraphFont">
     <w:name w:val="Default Paragraph Font"/>
     <w:uiPriority w:val="1"/>
+    <w:semiHidden/>
     <w:unhideWhenUsed/>
   </w:style>
   <w:style w:type="table" w:default="1" w:styleId="TableNormal">

</xml_diff>